<commit_message>
Updated Authors in Schema
</commit_message>
<xml_diff>
--- a/Project Step 6.docx
+++ b/Project Step 6.docx
@@ -107,13 +107,11 @@
         <w:spacing w:before="180" w:after="180" w:line="360" w:lineRule="auto"/>
         <w:rPr>
           <w:rStyle w:val="Hyperlink"/>
-          <w:rFonts w:ascii="Helvetica" w:hAnsi="Helvetica" w:cs="Helvetica"/>
           <w:shd w:val="clear" w:color="auto" w:fill="FFFFFF"/>
         </w:rPr>
       </w:pPr>
       <w:r>
         <w:rPr>
-          <w:rFonts w:ascii="Helvetica" w:hAnsi="Helvetica" w:cs="Helvetica"/>
           <w:color w:val="273540"/>
           <w:shd w:val="clear" w:color="auto" w:fill="FFFFFF"/>
         </w:rPr>
@@ -123,7 +121,6 @@
         <w:r>
           <w:rPr>
             <w:rStyle w:val="Hyperlink"/>
-            <w:rFonts w:ascii="Helvetica" w:hAnsi="Helvetica" w:cs="Helvetica"/>
             <w:shd w:val="clear" w:color="auto" w:fill="FFFFFF"/>
           </w:rPr>
           <w:t>http://classwork.engr.oregonstate.edu:1995</w:t>
@@ -151,138 +148,6 @@
     </w:p>
     <w:p>
       <w:pPr>
-        <w:ind w:firstLine="720"/>
-        <w:rPr>
-          <w:color w:val="273540"/>
-        </w:rPr>
-      </w:pPr>
-      <w:r>
-        <w:rPr>
-          <w:color w:val="273540"/>
-        </w:rPr>
-        <w:t>The process to create our database started out with creating an outline. We made a “blueprint of how our database was going to look.</w:t>
-      </w:r>
-    </w:p>
-    <w:p>
-      <w:pPr>
-        <w:ind w:firstLine="720"/>
-        <w:rPr>
-          <w:color w:val="273540"/>
-        </w:rPr>
-      </w:pPr>
-      <w:r>
-        <w:rPr>
-          <w:color w:val="273540"/>
-        </w:rPr>
-        <w:t xml:space="preserve"> After this, we revised our outline to be normalized as well as creating the DDL with our sample data. We had to maintain our code by making some updates; like adding an attribute for book medium, or maintaining variable numbers or name consistency. </w:t>
-      </w:r>
-    </w:p>
-    <w:p>
-      <w:pPr>
-        <w:ind w:firstLine="720"/>
-        <w:rPr>
-          <w:color w:val="273540"/>
-        </w:rPr>
-      </w:pPr>
-      <w:r>
-        <w:rPr>
-          <w:color w:val="273540"/>
-        </w:rPr>
-        <w:t xml:space="preserve">Then we took the CS340 lecture code and adapted it to get the website functional. We added our own schema and tables that were specific to the database we wanted to create. There </w:t>
-      </w:r>
-      <w:r>
-        <w:rPr>
-          <w:color w:val="273540"/>
-        </w:rPr>
-        <w:t>w</w:t>
-      </w:r>
-      <w:r>
-        <w:rPr>
-          <w:color w:val="273540"/>
-        </w:rPr>
-        <w:t>as care tak</w:t>
-      </w:r>
-      <w:r>
-        <w:rPr>
-          <w:color w:val="273540"/>
-        </w:rPr>
-        <w:t>en</w:t>
-      </w:r>
-      <w:r>
-        <w:rPr>
-          <w:color w:val="273540"/>
-        </w:rPr>
-        <w:t xml:space="preserve"> to apply feedback of creating a junction table,</w:t>
-      </w:r>
-      <w:r>
-        <w:rPr>
-          <w:color w:val="273540"/>
-        </w:rPr>
-        <w:t xml:space="preserve"> and our ability to work together was greatly aided by creating a Git repository.</w:t>
-      </w:r>
-    </w:p>
-    <w:p>
-      <w:pPr>
-        <w:ind w:firstLine="720"/>
-        <w:rPr>
-          <w:color w:val="273540"/>
-        </w:rPr>
-      </w:pPr>
-      <w:r>
-        <w:rPr>
-          <w:color w:val="273540"/>
-        </w:rPr>
-        <w:t xml:space="preserve">From here, we created a reset procedure and implemented some CRUD operations. </w:t>
-      </w:r>
-      <w:r>
-        <w:rPr>
-          <w:color w:val="273540"/>
-        </w:rPr>
-        <w:t xml:space="preserve">At this step, we decided on using a stylesheet to make the UI readable. </w:t>
-      </w:r>
-    </w:p>
-    <w:p>
-      <w:pPr>
-        <w:ind w:firstLine="720"/>
-        <w:rPr>
-          <w:color w:val="273540"/>
-        </w:rPr>
-      </w:pPr>
-      <w:r>
-        <w:rPr>
-          <w:color w:val="273540"/>
-        </w:rPr>
-        <w:t xml:space="preserve">The next step was to complete all the rest of the CRUD operations. </w:t>
-      </w:r>
-      <w:r>
-        <w:rPr>
-          <w:color w:val="273540"/>
-        </w:rPr>
-        <w:t>This step was helped by us delving into route handling and the creation of stored procedures.</w:t>
-      </w:r>
-    </w:p>
-    <w:p>
-      <w:pPr>
-        <w:ind w:firstLine="720"/>
-        <w:rPr>
-          <w:color w:val="273540"/>
-        </w:rPr>
-      </w:pPr>
-      <w:r>
-        <w:rPr>
-          <w:color w:val="273540"/>
-        </w:rPr>
-        <w:t>Lastly, we completed our project by finalizing any remaining fixes.</w:t>
-      </w:r>
-      <w:r>
-        <w:rPr>
-          <w:color w:val="273540"/>
-        </w:rPr>
-        <w:t xml:space="preserve"> This took a while to test out the solutions on bugs that remained. The very last thing we did was to craft an excellent summary which made its way to a zip file containing all of our deliverables.</w:t>
-      </w:r>
-    </w:p>
-    <w:p>
-      <w:pPr>
         <w:rPr>
           <w:color w:val="273540"/>
           <w:sz w:val="28"/>
@@ -290,6 +155,294 @@
           <w:u w:val="single"/>
         </w:rPr>
       </w:pPr>
+      <w:r>
+        <w:rPr>
+          <w:color w:val="273540"/>
+          <w:shd w:val="clear" w:color="auto" w:fill="FFFFFF"/>
+        </w:rPr>
+        <w:t>Our library management system evolved significantly through iterative feedback and fast development, transforming from a basic outline into a fully functional web application.</w:t>
+      </w:r>
+      <w:r>
+        <w:rPr>
+          <w:color w:val="273540"/>
+        </w:rPr>
+        <w:br/>
+      </w:r>
+      <w:r>
+        <w:rPr>
+          <w:color w:val="273540"/>
+          <w:u w:val="single"/>
+          <w:shd w:val="clear" w:color="auto" w:fill="FFFFFF"/>
+        </w:rPr>
+        <w:t>Initial Design &amp; Normalization</w:t>
+      </w:r>
+      <w:r>
+        <w:rPr>
+          <w:color w:val="273540"/>
+          <w:shd w:val="clear" w:color="auto" w:fill="FFFFFF"/>
+        </w:rPr>
+        <w:t xml:space="preserve">: We began by creating a database outline or "blueprint" then revised it to achieve normalization while drafting the DDL with sample data. Peer feedback from Skyla Chen and Jonathan Salfen during Step 1 revealed that our original schema lacked proper </w:t>
+      </w:r>
+      <w:proofErr w:type="gramStart"/>
+      <w:r>
+        <w:rPr>
+          <w:color w:val="273540"/>
+          <w:shd w:val="clear" w:color="auto" w:fill="FFFFFF"/>
+        </w:rPr>
+        <w:t>M:N</w:t>
+      </w:r>
+      <w:proofErr w:type="gramEnd"/>
+      <w:r>
+        <w:rPr>
+          <w:color w:val="273540"/>
+          <w:shd w:val="clear" w:color="auto" w:fill="FFFFFF"/>
+        </w:rPr>
+        <w:t xml:space="preserve"> relationships; we had initially linked Books directly to Authors, which would have caused data redundancy. Based on this, we added junction tables </w:t>
+      </w:r>
+      <w:proofErr w:type="spellStart"/>
+      <w:r>
+        <w:rPr>
+          <w:color w:val="273540"/>
+          <w:shd w:val="clear" w:color="auto" w:fill="FFFFFF"/>
+        </w:rPr>
+        <w:t>BookAuthors</w:t>
+      </w:r>
+      <w:proofErr w:type="spellEnd"/>
+      <w:r>
+        <w:rPr>
+          <w:color w:val="273540"/>
+          <w:shd w:val="clear" w:color="auto" w:fill="FFFFFF"/>
+        </w:rPr>
+        <w:t xml:space="preserve"> and </w:t>
+      </w:r>
+      <w:proofErr w:type="spellStart"/>
+      <w:r>
+        <w:rPr>
+          <w:color w:val="273540"/>
+          <w:shd w:val="clear" w:color="auto" w:fill="FFFFFF"/>
+        </w:rPr>
+        <w:t>BookGenres</w:t>
+      </w:r>
+      <w:proofErr w:type="spellEnd"/>
+      <w:r>
+        <w:rPr>
+          <w:color w:val="273540"/>
+          <w:shd w:val="clear" w:color="auto" w:fill="FFFFFF"/>
+        </w:rPr>
+        <w:t xml:space="preserve">, eliminating duplication. Additional refinements included adding a </w:t>
+      </w:r>
+      <w:proofErr w:type="spellStart"/>
+      <w:r>
+        <w:rPr>
+          <w:color w:val="273540"/>
+          <w:shd w:val="clear" w:color="auto" w:fill="FFFFFF"/>
+        </w:rPr>
+        <w:t>bookMedia</w:t>
+      </w:r>
+      <w:proofErr w:type="spellEnd"/>
+      <w:r>
+        <w:rPr>
+          <w:color w:val="273540"/>
+          <w:shd w:val="clear" w:color="auto" w:fill="FFFFFF"/>
+        </w:rPr>
+        <w:t xml:space="preserve"> attribute, standardizing phone number lengths, and ensuring naming consistency throughout. </w:t>
+      </w:r>
+      <w:r>
+        <w:rPr>
+          <w:color w:val="273540"/>
+        </w:rPr>
+        <w:br/>
+      </w:r>
+      <w:r>
+        <w:rPr>
+          <w:color w:val="273540"/>
+          <w:u w:val="single"/>
+          <w:shd w:val="clear" w:color="auto" w:fill="FFFFFF"/>
+        </w:rPr>
+        <w:t>UI Development &amp; Collaboration:</w:t>
+      </w:r>
+      <w:r>
+        <w:rPr>
+          <w:color w:val="273540"/>
+          <w:shd w:val="clear" w:color="auto" w:fill="FFFFFF"/>
+        </w:rPr>
+        <w:t xml:space="preserve"> We adapted the CS340 lecture code to build our website's foundation, customizing it with our own schema and tables. Creating a Git repository greatly aided team coordination, allowing us to track changes and merge work seamlessly. Cameron Brooks identified inconsistencies in our phone number field (</w:t>
+      </w:r>
+      <w:proofErr w:type="gramStart"/>
+      <w:r>
+        <w:rPr>
+          <w:color w:val="273540"/>
+          <w:shd w:val="clear" w:color="auto" w:fill="FFFFFF"/>
+        </w:rPr>
+        <w:t>VARCHAR(</w:t>
+      </w:r>
+      <w:proofErr w:type="gramEnd"/>
+      <w:r>
+        <w:rPr>
+          <w:color w:val="273540"/>
+          <w:shd w:val="clear" w:color="auto" w:fill="FFFFFF"/>
+        </w:rPr>
+        <w:t>10) in our outline vs VARCHAR(12) in our DDL), which we standardized to VARCHAR(12) to accommodate formatted numbers. Thai-</w:t>
+      </w:r>
+      <w:proofErr w:type="spellStart"/>
+      <w:r>
+        <w:rPr>
+          <w:color w:val="273540"/>
+          <w:shd w:val="clear" w:color="auto" w:fill="FFFFFF"/>
+        </w:rPr>
+        <w:t>Binh</w:t>
+      </w:r>
+      <w:proofErr w:type="spellEnd"/>
+      <w:r>
+        <w:rPr>
+          <w:color w:val="273540"/>
+          <w:shd w:val="clear" w:color="auto" w:fill="FFFFFF"/>
+        </w:rPr>
+        <w:t xml:space="preserve"> </w:t>
+      </w:r>
+      <w:proofErr w:type="spellStart"/>
+      <w:r>
+        <w:rPr>
+          <w:color w:val="273540"/>
+          <w:shd w:val="clear" w:color="auto" w:fill="FFFFFF"/>
+        </w:rPr>
+        <w:t>Guerreiro</w:t>
+      </w:r>
+      <w:proofErr w:type="spellEnd"/>
+      <w:r>
+        <w:rPr>
+          <w:color w:val="273540"/>
+          <w:shd w:val="clear" w:color="auto" w:fill="FFFFFF"/>
+        </w:rPr>
+        <w:t xml:space="preserve"> suggested using ENUM for </w:t>
+      </w:r>
+      <w:proofErr w:type="spellStart"/>
+      <w:r>
+        <w:rPr>
+          <w:color w:val="273540"/>
+          <w:shd w:val="clear" w:color="auto" w:fill="FFFFFF"/>
+        </w:rPr>
+        <w:t>bookMedia</w:t>
+      </w:r>
+      <w:proofErr w:type="spellEnd"/>
+      <w:r>
+        <w:rPr>
+          <w:color w:val="273540"/>
+          <w:shd w:val="clear" w:color="auto" w:fill="FFFFFF"/>
+        </w:rPr>
+        <w:t xml:space="preserve"> instead of freeform VARCHAR, which we implemented to ensure data consistency.</w:t>
+      </w:r>
+      <w:r>
+        <w:rPr>
+          <w:color w:val="273540"/>
+        </w:rPr>
+        <w:br/>
+      </w:r>
+      <w:r>
+        <w:rPr>
+          <w:color w:val="273540"/>
+          <w:u w:val="single"/>
+          <w:shd w:val="clear" w:color="auto" w:fill="FFFFFF"/>
+        </w:rPr>
+        <w:t>CRUD Implementation</w:t>
+      </w:r>
+      <w:r>
+        <w:rPr>
+          <w:color w:val="273540"/>
+          <w:shd w:val="clear" w:color="auto" w:fill="FFFFFF"/>
+        </w:rPr>
+        <w:t xml:space="preserve">: We first created a reset procedure and implemented basic CRUD operations while applying a stylesheet to make the UI clean and readable. Alexander Jones and Brandon </w:t>
+      </w:r>
+      <w:proofErr w:type="spellStart"/>
+      <w:r>
+        <w:rPr>
+          <w:color w:val="273540"/>
+          <w:shd w:val="clear" w:color="auto" w:fill="FFFFFF"/>
+        </w:rPr>
+        <w:t>Pacewic</w:t>
+      </w:r>
+      <w:proofErr w:type="spellEnd"/>
+      <w:r>
+        <w:rPr>
+          <w:color w:val="273540"/>
+          <w:shd w:val="clear" w:color="auto" w:fill="FFFFFF"/>
+        </w:rPr>
+        <w:t xml:space="preserve"> noted that our initial interface displayed raw foreign key IDs instead of readable labels, so we redesigned all tables to show book titles, author names, and patron names using JOIN queries, making the interface intuitive for non-technical users. Based on feedback from Cody </w:t>
+      </w:r>
+      <w:proofErr w:type="spellStart"/>
+      <w:r>
+        <w:rPr>
+          <w:color w:val="273540"/>
+          <w:shd w:val="clear" w:color="auto" w:fill="FFFFFF"/>
+        </w:rPr>
+        <w:t>Strehlow</w:t>
+      </w:r>
+      <w:proofErr w:type="spellEnd"/>
+      <w:r>
+        <w:rPr>
+          <w:color w:val="273540"/>
+          <w:shd w:val="clear" w:color="auto" w:fill="FFFFFF"/>
+        </w:rPr>
+        <w:t xml:space="preserve"> and Zachary Sherman about missing DELETE functionality, we expanded to full CRUD operations for all tables, including intersection tables, and created stored procedures for all CUD operations. Delving into route handling and stored procedure creation was critical during this phase.</w:t>
+      </w:r>
+      <w:r>
+        <w:rPr>
+          <w:color w:val="273540"/>
+        </w:rPr>
+        <w:br/>
+      </w:r>
+      <w:r>
+        <w:rPr>
+          <w:color w:val="273540"/>
+          <w:u w:val="single"/>
+          <w:shd w:val="clear" w:color="auto" w:fill="FFFFFF"/>
+        </w:rPr>
+        <w:t>Final Polish &amp; Testing:</w:t>
+      </w:r>
+      <w:r>
+        <w:rPr>
+          <w:color w:val="273540"/>
+          <w:shd w:val="clear" w:color="auto" w:fill="FFFFFF"/>
+        </w:rPr>
+        <w:t xml:space="preserve"> We completed the project by addressing remaining bugs, which required thorough testing of edge cases and database constraints. The very last step was compiling this summary and packing all deliverable into a zip file for submission.</w:t>
+      </w:r>
+      <w:r>
+        <w:rPr>
+          <w:color w:val="273540"/>
+        </w:rPr>
+        <w:br/>
+      </w:r>
+      <w:r>
+        <w:rPr>
+          <w:color w:val="273540"/>
+          <w:u w:val="single"/>
+          <w:shd w:val="clear" w:color="auto" w:fill="FFFFFF"/>
+        </w:rPr>
+        <w:t>Reflection on AI Tools:</w:t>
+      </w:r>
+      <w:r>
+        <w:rPr>
+          <w:color w:val="273540"/>
+          <w:shd w:val="clear" w:color="auto" w:fill="FFFFFF"/>
+        </w:rPr>
+        <w:t xml:space="preserve"> Throughout development, we used </w:t>
+      </w:r>
+      <w:proofErr w:type="spellStart"/>
+      <w:r>
+        <w:rPr>
+          <w:color w:val="273540"/>
+          <w:shd w:val="clear" w:color="auto" w:fill="FFFFFF"/>
+        </w:rPr>
+        <w:t>ChatGPT</w:t>
+      </w:r>
+      <w:proofErr w:type="spellEnd"/>
+      <w:r>
+        <w:rPr>
+          <w:color w:val="273540"/>
+          <w:shd w:val="clear" w:color="auto" w:fill="FFFFFF"/>
+        </w:rPr>
+        <w:t xml:space="preserve"> strategically, it helped debug complex JOIN queries in our Books page and assisted with syntax errors in stored procedures. However, AI-generated code required manual verification. We learned that AI excels at specific task like debugging and boilerplate generation, but architectural decisions require human oversight.</w:t>
+      </w:r>
       <w:r>
         <w:rPr>
           <w:color w:val="273540"/>
@@ -2015,12 +2168,13 @@
         <w:lastRenderedPageBreak/>
         <w:t>Sample Data:</w:t>
       </w:r>
+      <w:bookmarkStart w:id="9" w:name="_GoBack"/>
+      <w:bookmarkEnd w:id="9"/>
     </w:p>
     <w:p>
       <w:pPr>
         <w:shd w:val="clear" w:color="auto" w:fill="FFFFFF"/>
         <w:spacing w:before="180" w:after="180"/>
-        <w:jc w:val="center"/>
         <w:rPr>
           <w:bCs/>
           <w:color w:val="273540"/>
@@ -2096,7 +2250,6 @@
       <w:pPr>
         <w:shd w:val="clear" w:color="auto" w:fill="FFFFFF"/>
         <w:spacing w:before="180" w:after="180"/>
-        <w:jc w:val="center"/>
         <w:rPr>
           <w:bCs/>
           <w:color w:val="273540"/>
@@ -2172,7 +2325,6 @@
       <w:pPr>
         <w:shd w:val="clear" w:color="auto" w:fill="FFFFFF"/>
         <w:spacing w:before="180" w:after="180"/>
-        <w:jc w:val="center"/>
         <w:rPr>
           <w:bCs/>
           <w:color w:val="273540"/>
@@ -2208,34 +2360,47 @@
           <w:szCs w:val="24"/>
         </w:rPr>
         <w:drawing>
-          <wp:inline distT="114300" distB="114300" distL="114300" distR="114300">
-            <wp:extent cx="5943600" cy="876300"/>
-            <wp:effectExtent l="0" t="0" r="0" b="0"/>
-            <wp:docPr id="2" name="image3.png"/>
-            <wp:cNvGraphicFramePr/>
+          <wp:inline distT="0" distB="0" distL="0" distR="0">
+            <wp:extent cx="4982210" cy="1050925"/>
+            <wp:effectExtent l="0" t="0" r="8890" b="0"/>
+            <wp:docPr id="12" name="Picture 12"/>
+            <wp:cNvGraphicFramePr>
+              <a:graphicFrameLocks xmlns:a="http://schemas.openxmlformats.org/drawingml/2006/main" noChangeAspect="1"/>
+            </wp:cNvGraphicFramePr>
             <a:graphic xmlns:a="http://schemas.openxmlformats.org/drawingml/2006/main">
               <a:graphicData uri="http://schemas.openxmlformats.org/drawingml/2006/picture">
                 <pic:pic xmlns:pic="http://schemas.openxmlformats.org/drawingml/2006/picture">
                   <pic:nvPicPr>
-                    <pic:cNvPr id="0" name="image3.png"/>
-                    <pic:cNvPicPr preferRelativeResize="0"/>
+                    <pic:cNvPr id="0" name="Picture 6"/>
+                    <pic:cNvPicPr>
+                      <a:picLocks noChangeAspect="1" noChangeArrowheads="1"/>
+                    </pic:cNvPicPr>
                   </pic:nvPicPr>
                   <pic:blipFill>
-                    <a:blip r:embed="rId10"/>
+                    <a:blip r:embed="rId10">
+                      <a:extLst>
+                        <a:ext uri="{28A0092B-C50C-407E-A947-70E740481C1C}">
+                          <a14:useLocalDpi xmlns:a14="http://schemas.microsoft.com/office/drawing/2010/main" val="0"/>
+                        </a:ext>
+                      </a:extLst>
+                    </a:blip>
                     <a:srcRect/>
                     <a:stretch>
                       <a:fillRect/>
                     </a:stretch>
                   </pic:blipFill>
-                  <pic:spPr>
+                  <pic:spPr bwMode="auto">
                     <a:xfrm>
                       <a:off x="0" y="0"/>
-                      <a:ext cx="5943600" cy="876300"/>
+                      <a:ext cx="4982210" cy="1050925"/>
                     </a:xfrm>
                     <a:prstGeom prst="rect">
                       <a:avLst/>
                     </a:prstGeom>
-                    <a:ln/>
+                    <a:noFill/>
+                    <a:ln>
+                      <a:noFill/>
+                    </a:ln>
                   </pic:spPr>
                 </pic:pic>
               </a:graphicData>
@@ -2419,6 +2584,7 @@
           <w:sz w:val="24"/>
           <w:szCs w:val="24"/>
         </w:rPr>
+        <w:lastRenderedPageBreak/>
         <w:t>BookAuthors</w:t>
       </w:r>
       <w:proofErr w:type="spellEnd"/>
@@ -2440,7 +2606,6 @@
           <w:sz w:val="24"/>
           <w:szCs w:val="24"/>
         </w:rPr>
-        <w:lastRenderedPageBreak/>
         <w:drawing>
           <wp:inline distT="114300" distB="114300" distL="114300" distR="114300">
             <wp:extent cx="5943600" cy="1714500"/>
@@ -2640,17 +2805,7 @@
           <w:u w:val="single"/>
         </w:rPr>
         <w:lastRenderedPageBreak/>
-        <w:t>Screen Captures</w:t>
-      </w:r>
-      <w:r>
-        <w:rPr>
-          <w:b/>
-          <w:bCs/>
-          <w:sz w:val="24"/>
-          <w:szCs w:val="24"/>
-          <w:u w:val="single"/>
-        </w:rPr>
-        <w:t>:</w:t>
+        <w:t>Screen Captures:</w:t>
       </w:r>
       <w:r>
         <w:rPr>
@@ -2756,13 +2911,7 @@
     <w:p>
       <w:r>
         <w:lastRenderedPageBreak/>
-        <w:t xml:space="preserve">DISPLAY/CREATE/UPDATE/DELETE </w:t>
-      </w:r>
-      <w:r>
-        <w:t>Books</w:t>
-      </w:r>
-      <w:r>
-        <w:t xml:space="preserve"> Page</w:t>
+        <w:t>DISPLAY/CREATE/UPDATE/DELETE Books Page</w:t>
       </w:r>
     </w:p>
     <w:p>
@@ -2823,13 +2972,7 @@
     <w:p>
       <w:r>
         <w:lastRenderedPageBreak/>
-        <w:t xml:space="preserve">DISPLAY/CREATE/UPDATE/DELETE </w:t>
-      </w:r>
-      <w:r>
-        <w:t>Authors</w:t>
-      </w:r>
-      <w:r>
-        <w:t xml:space="preserve"> Page</w:t>
+        <w:t>DISPLAY/CREATE/UPDATE/DELETE Authors Page</w:t>
       </w:r>
     </w:p>
     <w:p>
@@ -2877,19 +3020,7 @@
     <w:p>
       <w:r>
         <w:lastRenderedPageBreak/>
-        <w:t>DISPLAY/CREATE/UPDATE</w:t>
-      </w:r>
-      <w:r>
-        <w:t>/DELETE</w:t>
-      </w:r>
-      <w:r>
-        <w:t xml:space="preserve"> </w:t>
-      </w:r>
-      <w:r>
-        <w:t>Genres</w:t>
-      </w:r>
-      <w:r>
-        <w:t xml:space="preserve"> Page</w:t>
+        <w:t>DISPLAY/CREATE/UPDATE/DELETE Genres Page</w:t>
       </w:r>
     </w:p>
     <w:p>
@@ -2937,13 +3068,7 @@
     <w:p>
       <w:r>
         <w:lastRenderedPageBreak/>
-        <w:t xml:space="preserve">DISPLAY/CREATE/UPDATE/DELETE </w:t>
-      </w:r>
-      <w:r>
-        <w:t>Patrons</w:t>
-      </w:r>
-      <w:r>
-        <w:t xml:space="preserve"> Page</w:t>
+        <w:t>DISPLAY/CREATE/UPDATE/DELETE Patrons Page</w:t>
       </w:r>
     </w:p>
     <w:p>
@@ -2991,7 +3116,6 @@
     <w:p>
       <w:pPr>
         <w:rPr>
-          <w:rFonts w:ascii="Helvetica" w:hAnsi="Helvetica" w:cs="Helvetica"/>
           <w:color w:val="273540"/>
           <w:shd w:val="clear" w:color="auto" w:fill="FFFFFF"/>
         </w:rPr>
@@ -3002,7 +3126,6 @@
       </w:r>
       <w:r>
         <w:rPr>
-          <w:rFonts w:ascii="Helvetica" w:hAnsi="Helvetica" w:cs="Helvetica"/>
           <w:color w:val="273540"/>
           <w:shd w:val="clear" w:color="auto" w:fill="FFFFFF"/>
         </w:rPr>
@@ -3011,7 +3134,6 @@
       <w:proofErr w:type="gramStart"/>
       <w:r>
         <w:rPr>
-          <w:rFonts w:ascii="Helvetica" w:hAnsi="Helvetica" w:cs="Helvetica"/>
           <w:color w:val="273540"/>
           <w:shd w:val="clear" w:color="auto" w:fill="FFFFFF"/>
         </w:rPr>
@@ -3020,24 +3142,15 @@
       <w:proofErr w:type="gramEnd"/>
       <w:r>
         <w:rPr>
-          <w:rFonts w:ascii="Helvetica" w:hAnsi="Helvetica" w:cs="Helvetica"/>
           <w:color w:val="273540"/>
           <w:shd w:val="clear" w:color="auto" w:fill="FFFFFF"/>
         </w:rPr>
         <w:t xml:space="preserve"> &amp; Update of a M:N</w:t>
       </w:r>
-      <w:bookmarkStart w:id="9" w:name="_GoBack"/>
-      <w:bookmarkEnd w:id="9"/>
-    </w:p>
-    <w:p>
-      <w:r>
-        <w:t xml:space="preserve">Book </w:t>
-      </w:r>
-      <w:r>
-        <w:t>Copies</w:t>
-      </w:r>
-      <w:r>
-        <w:t xml:space="preserve"> Junction Page</w:t>
+    </w:p>
+    <w:p>
+      <w:r>
+        <w:t>Book Copies Junction Page</w:t>
       </w:r>
     </w:p>
     <w:p>
@@ -3101,13 +3214,7 @@
       </w:pPr>
       <w:r>
         <w:lastRenderedPageBreak/>
-        <w:t xml:space="preserve">DISPLAY/CREATE/UPDATE/DELETE </w:t>
-      </w:r>
-      <w:r>
-        <w:t>Loans</w:t>
-      </w:r>
-      <w:r>
-        <w:t xml:space="preserve"> Page</w:t>
+        <w:t>DISPLAY/CREATE/UPDATE/DELETE Loans Page</w:t>
       </w:r>
       <w:r>
         <w:rPr>
@@ -3166,7 +3273,6 @@
     <w:p>
       <w:pPr>
         <w:rPr>
-          <w:rFonts w:ascii="Helvetica" w:hAnsi="Helvetica" w:cs="Helvetica"/>
           <w:color w:val="273540"/>
           <w:shd w:val="clear" w:color="auto" w:fill="FFFFFF"/>
         </w:rPr>
@@ -3176,7 +3282,6 @@
       </w:r>
       <w:r>
         <w:rPr>
-          <w:rFonts w:ascii="Helvetica" w:hAnsi="Helvetica" w:cs="Helvetica"/>
           <w:color w:val="273540"/>
           <w:shd w:val="clear" w:color="auto" w:fill="FFFFFF"/>
         </w:rPr>
@@ -3185,7 +3290,6 @@
       <w:proofErr w:type="gramStart"/>
       <w:r>
         <w:rPr>
-          <w:rFonts w:ascii="Helvetica" w:hAnsi="Helvetica" w:cs="Helvetica"/>
           <w:color w:val="273540"/>
           <w:shd w:val="clear" w:color="auto" w:fill="FFFFFF"/>
         </w:rPr>
@@ -3194,7 +3298,6 @@
       <w:proofErr w:type="gramEnd"/>
       <w:r>
         <w:rPr>
-          <w:rFonts w:ascii="Helvetica" w:hAnsi="Helvetica" w:cs="Helvetica"/>
           <w:color w:val="273540"/>
           <w:shd w:val="clear" w:color="auto" w:fill="FFFFFF"/>
         </w:rPr>
@@ -3203,13 +3306,7 @@
     </w:p>
     <w:p>
       <w:r>
-        <w:t xml:space="preserve">Book </w:t>
-      </w:r>
-      <w:r>
-        <w:t>Author</w:t>
-      </w:r>
-      <w:r>
-        <w:t xml:space="preserve"> Junction Page</w:t>
+        <w:t>Book Author Junction Page</w:t>
       </w:r>
     </w:p>
     <w:p>
@@ -3268,21 +3365,16 @@
     <w:p>
       <w:pPr>
         <w:rPr>
-          <w:rFonts w:ascii="Helvetica" w:hAnsi="Helvetica" w:cs="Helvetica"/>
           <w:color w:val="273540"/>
           <w:shd w:val="clear" w:color="auto" w:fill="FFFFFF"/>
         </w:rPr>
       </w:pPr>
       <w:r>
         <w:lastRenderedPageBreak/>
-        <w:t xml:space="preserve">DISPLAY/CREATE/UPDATE/DELETE </w:t>
-      </w:r>
-      <w:r>
-        <w:t xml:space="preserve">&amp; </w:t>
-      </w:r>
-      <w:r>
-        <w:rPr>
-          <w:rFonts w:ascii="Helvetica" w:hAnsi="Helvetica" w:cs="Helvetica"/>
+        <w:t xml:space="preserve">DISPLAY/CREATE/UPDATE/DELETE &amp; </w:t>
+      </w:r>
+      <w:r>
+        <w:rPr>
           <w:color w:val="273540"/>
           <w:shd w:val="clear" w:color="auto" w:fill="FFFFFF"/>
         </w:rPr>
@@ -3291,7 +3383,6 @@
       <w:proofErr w:type="gramStart"/>
       <w:r>
         <w:rPr>
-          <w:rFonts w:ascii="Helvetica" w:hAnsi="Helvetica" w:cs="Helvetica"/>
           <w:color w:val="273540"/>
           <w:shd w:val="clear" w:color="auto" w:fill="FFFFFF"/>
         </w:rPr>
@@ -3300,27 +3391,15 @@
       <w:proofErr w:type="gramEnd"/>
       <w:r>
         <w:rPr>
-          <w:rFonts w:ascii="Helvetica" w:hAnsi="Helvetica" w:cs="Helvetica"/>
           <w:color w:val="273540"/>
           <w:shd w:val="clear" w:color="auto" w:fill="FFFFFF"/>
         </w:rPr>
-        <w:t xml:space="preserve"> &amp; </w:t>
-      </w:r>
-      <w:r>
-        <w:rPr>
-          <w:rFonts w:ascii="Helvetica" w:hAnsi="Helvetica" w:cs="Helvetica"/>
-          <w:color w:val="273540"/>
-          <w:shd w:val="clear" w:color="auto" w:fill="FFFFFF"/>
-        </w:rPr>
-        <w:t>Update of a M:N</w:t>
-      </w:r>
-    </w:p>
-    <w:p>
-      <w:r>
-        <w:t>Book Genre Junction</w:t>
-      </w:r>
-      <w:r>
-        <w:t xml:space="preserve"> Page</w:t>
+        <w:t xml:space="preserve"> &amp; Update of a M:N</w:t>
+      </w:r>
+    </w:p>
+    <w:p>
+      <w:r>
+        <w:t>Book Genre Junction Page</w:t>
       </w:r>
     </w:p>
     <w:p>

</xml_diff>